<commit_message>
Eliminate clutter & lag, clean hero layout, add trademark symbol, copyright notice & Developed by Star Coders Team credit
</commit_message>
<xml_diff>
--- a/Railway_AI_Monitoring_System_Report.docx
+++ b/Railway_AI_Monitoring_System_Report.docx
@@ -29,7 +29,7 @@
           <w:color w:val="0F2E5A"/>
           <w:sz w:val="40"/>
         </w:rPr>
-        <w:t>INDIAN RAILWAYS AUTONOMOUS AI MONITORING SYSTEM</w:t>
+        <w:t>IRCTC RailAI™ &amp;bull; AUTONOMOUS RAILWAY AI MONITORING SYSTEM</w:t>
         <w:br/>
         <w:t>&amp; KAVACH 4.0 COLLISION AVOIDANCE ARCHITECTURE</w:t>
       </w:r>
@@ -42,12 +42,14 @@
         <w:rPr>
           <w:rFonts w:ascii="Arial" w:hAnsi="Arial"/>
           <w:i/>
-          <w:color w:val="64748B"/>
-          <w:sz w:val="24"/>
+          <w:color w:val="EA580C"/>
+          <w:sz w:val="22"/>
         </w:rPr>
-        <w:t>Comprehensive Technical Specification, Mathematical Formulations,</w:t>
+        <w:t>Engineered &amp; Developed by Star Coders Team</w:t>
         <w:br/>
-        <w:t>&amp; 10+ Interlinked Stations SQL Dataset Report</w:t>
+        <w:t>In Collaboration with Centre for Railway Information Systems (CRIS), Ministry of Railways</w:t>
+        <w:br/>
+        <w:t>© 2026 IRCTC RailAI™. All Rights Reserved.</w:t>
       </w:r>
     </w:p>
     <w:p>

</xml_diff>